<commit_message>
ARK-493-498: correct repository count 10->9 (series is a subdirectory of this repo, not a new repo)
The reconciliation report and publication batch incorrectly counted this
series as adding a new repository. It was published as the ark-493-498/
subdirectory of the existing executionproof-testbeds repo, so the standing
repository total remains 9, not 10. Corrected in reconciliation_report and
publication_batch (md/pdf/docx). All other headline numbers unchanged:
72 experiments / 232 case records / 229 PASS / 2 FAIL / 1 GATE-STOP.
</commit_message>
<xml_diff>
--- a/ark-493-498/results/publication_batch.docx
+++ b/ark-493-498/results/publication_batch.docx
@@ -115,17 +115,51 @@
       <w:r>
         <w:t xml:space="preserve">; negative results (FAIL, GATE-STOP) are reported, not suppressed.</w:t>
       </w:r>
-    </w:p>
-    <w:p>
-      <w:pPr>
-        <w:pStyle w:val="BodyText"/>
-      </w:pPr>
+      <w:r>
+        <w:t xml:space="preserve"> </w:t>
+      </w:r>
       <w:r>
         <w:rPr>
           <w:bCs/>
           <w:b/>
         </w:rPr>
-        <w:t xml:space="preserve">Reconciled public headline numbers (use everywhere):</w:t>
+        <w:t xml:space="preserve">Repository count (corrected):</w:t>
+      </w:r>
+      <w:r>
+        <w:t xml:space="preserve"> </w:t>
+      </w:r>
+      <w:r>
+        <w:t xml:space="preserve">this series was published as the</w:t>
+      </w:r>
+      <w:r>
+        <w:t xml:space="preserve"> </w:t>
+      </w:r>
+      <w:r>
+        <w:rPr>
+          <w:rStyle w:val="VerbatimChar"/>
+        </w:rPr>
+        <w:t xml:space="preserve">ark-493-498/</w:t>
+      </w:r>
+      <w:r>
+        <w:t xml:space="preserve"> </w:t>
+      </w:r>
+      <w:r>
+        <w:t xml:space="preserve">subdirectory of the existing</w:t>
+      </w:r>
+      <w:r>
+        <w:t xml:space="preserve"> </w:t>
+      </w:r>
+      <w:r>
+        <w:rPr>
+          <w:rStyle w:val="VerbatimChar"/>
+        </w:rPr>
+        <w:t xml:space="preserve">executionproof-testbeds</w:t>
+      </w:r>
+      <w:r>
+        <w:t xml:space="preserve"> </w:t>
+      </w:r>
+      <w:r>
+        <w:t xml:space="preserve">repository — it creates</w:t>
       </w:r>
       <w:r>
         <w:t xml:space="preserve"> </w:t>
@@ -135,7 +169,48 @@
           <w:bCs/>
           <w:b/>
         </w:rPr>
-        <w:t xml:space="preserve">72 preregistered experiments · 232 case records · 229 PASS · 2 FAIL · 1 GATE-STOP · 10 repositories.</w:t>
+        <w:t xml:space="preserve">no new repository</w:t>
+      </w:r>
+      <w:r>
+        <w:t xml:space="preserve">, so the repository total stays</w:t>
+      </w:r>
+      <w:r>
+        <w:t xml:space="preserve"> </w:t>
+      </w:r>
+      <w:r>
+        <w:rPr>
+          <w:bCs/>
+          <w:b/>
+        </w:rPr>
+        <w:t xml:space="preserve">9</w:t>
+      </w:r>
+      <w:r>
+        <w:t xml:space="preserve"> </w:t>
+      </w:r>
+      <w:r>
+        <w:t xml:space="preserve">(not 10).</w:t>
+      </w:r>
+    </w:p>
+    <w:p>
+      <w:pPr>
+        <w:pStyle w:val="BodyText"/>
+      </w:pPr>
+      <w:r>
+        <w:rPr>
+          <w:bCs/>
+          <w:b/>
+        </w:rPr>
+        <w:t xml:space="preserve">Reconciled public headline numbers (use everywhere):</w:t>
+      </w:r>
+      <w:r>
+        <w:t xml:space="preserve"> </w:t>
+      </w:r>
+      <w:r>
+        <w:rPr>
+          <w:bCs/>
+          <w:b/>
+        </w:rPr>
+        <w:t xml:space="preserve">72 preregistered experiments · 232 case records · 229 PASS · 2 FAIL · 1 GATE-STOP · 9 repositories.</w:t>
       </w:r>
       <w:r>
         <w:t xml:space="preserve"> </w:t>
@@ -480,7 +555,7 @@
         <w:rPr>
           <w:rStyle w:val="NormalTok"/>
         </w:rPr>
-        <w:t xml:space="preserve">1 GATE-STOP · 10 repositories.** The 2 FAIL and 1 GATE-STOP records are retained</w:t>
+        <w:t xml:space="preserve">1 GATE-STOP · 9 repositories.** The 2 FAIL and 1 GATE-STOP records are retained</w:t>
       </w:r>
       <w:r>
         <w:br/>
@@ -809,7 +884,7 @@
         <w:t xml:space="preserve"> </w:t>
       </w:r>
       <w:r>
-        <w:t xml:space="preserve">&gt; Standing reconciled corpus across all series to date: 72 preregistered experiments, 232 case records, 229 PASS, 2 FAIL, 1 GATE-STOP, across 10 repositories. Negative results (FAIL, GATE-STOP) are retained unchanged.</w:t>
+        <w:t xml:space="preserve">&gt; Standing reconciled corpus across all series to date: 72 preregistered experiments, 232 case records, 229 PASS, 2 FAIL, 1 GATE-STOP, across 9 repositories. Negative results (FAIL, GATE-STOP) are retained unchanged.</w:t>
       </w:r>
     </w:p>
     <w:p>
@@ -1001,7 +1076,7 @@
           <w:bCs/>
           <w:b/>
         </w:rPr>
-        <w:t xml:space="preserve">72 preregistered experiments · 232 case records · 229 PASS · 2 FAIL · 1 GATE-STOP · 10 repositories.</w:t>
+        <w:t xml:space="preserve">72 preregistered experiments · 232 case records · 229 PASS · 2 FAIL · 1 GATE-STOP · 9 repositories.</w:t>
       </w:r>
     </w:p>
     <w:p>

</xml_diff>